<commit_message>
Include vocal WAV download in downloadable press kits
</commit_message>
<xml_diff>
--- a/assets/four-boys-maybe-five-press-release-hebrew.docx
+++ b/assets/four-boys-maybe-five-press-release-hebrew.docx
@@ -2011,216 +2011,34 @@
           <w:szCs w:val="26"/>
         </w:rPr>
       </w:pPr>
-      <w:r>
-        <w:rPr>
-          <w:rFonts w:ascii="Alef" w:cs="Alef" w:eastAsia="Alef" w:hAnsi="Alef"/>
-          <w:b w:val="1"/>
-          <w:bCs w:val="1"/>
-          <w:color w:val="635c54"/>
-          <w:sz w:val="26"/>
-          <w:szCs w:val="26"/>
-          <w:rtl w:val="1"/>
-        </w:rPr>
-        <w:t xml:space="preserve">האזנה</w:t>
-      </w:r>
-      <w:r>
-        <w:rPr>
-          <w:rFonts w:ascii="Alef" w:cs="Alef" w:eastAsia="Alef" w:hAnsi="Alef"/>
-          <w:b w:val="1"/>
-          <w:bCs w:val="1"/>
-          <w:color w:val="635c54"/>
-          <w:sz w:val="26"/>
-          <w:szCs w:val="26"/>
-          <w:rtl w:val="1"/>
-        </w:rPr>
-        <w:t xml:space="preserve"> </w:t>
-      </w:r>
-      <w:r>
-        <w:rPr>
-          <w:rFonts w:ascii="Alef" w:cs="Alef" w:eastAsia="Alef" w:hAnsi="Alef"/>
-          <w:b w:val="1"/>
-          <w:bCs w:val="1"/>
-          <w:color w:val="635c54"/>
-          <w:sz w:val="26"/>
-          <w:szCs w:val="26"/>
-          <w:rtl w:val="1"/>
-        </w:rPr>
-        <w:t xml:space="preserve">לשיר</w:t>
-      </w:r>
-      <w:r>
-        <w:rPr>
-          <w:rFonts w:ascii="Alef" w:cs="Alef" w:eastAsia="Alef" w:hAnsi="Alef"/>
-          <w:b w:val="1"/>
-          <w:bCs w:val="1"/>
-          <w:color w:val="635c54"/>
-          <w:sz w:val="26"/>
-          <w:szCs w:val="26"/>
-          <w:rtl w:val="1"/>
-        </w:rPr>
-        <w:t xml:space="preserve"> </w:t>
-      </w:r>
-      <w:r>
-        <w:rPr>
-          <w:rFonts w:ascii="Alef" w:cs="Alef" w:eastAsia="Alef" w:hAnsi="Alef"/>
-          <w:b w:val="1"/>
-          <w:bCs w:val="1"/>
-          <w:color w:val="635c54"/>
-          <w:sz w:val="26"/>
-          <w:szCs w:val="26"/>
-          <w:rtl w:val="1"/>
-        </w:rPr>
-        <w:t xml:space="preserve">טרום</w:t>
-      </w:r>
-      <w:r>
-        <w:rPr>
-          <w:rFonts w:ascii="Alef" w:cs="Alef" w:eastAsia="Alef" w:hAnsi="Alef"/>
-          <w:b w:val="1"/>
-          <w:bCs w:val="1"/>
-          <w:color w:val="635c54"/>
-          <w:sz w:val="26"/>
-          <w:szCs w:val="26"/>
-          <w:rtl w:val="1"/>
-        </w:rPr>
-        <w:t xml:space="preserve"> </w:t>
-      </w:r>
-      <w:r>
-        <w:rPr>
-          <w:rFonts w:ascii="Alef" w:cs="Alef" w:eastAsia="Alef" w:hAnsi="Alef"/>
-          <w:b w:val="1"/>
-          <w:bCs w:val="1"/>
-          <w:color w:val="635c54"/>
-          <w:sz w:val="26"/>
-          <w:szCs w:val="26"/>
-          <w:rtl w:val="1"/>
-        </w:rPr>
-        <w:t xml:space="preserve">יציאתו</w:t>
-      </w:r>
-      <w:r>
-        <w:rPr>
-          <w:rFonts w:ascii="Alef" w:cs="Alef" w:eastAsia="Alef" w:hAnsi="Alef"/>
-          <w:b w:val="1"/>
-          <w:bCs w:val="1"/>
-          <w:color w:val="635c54"/>
-          <w:sz w:val="26"/>
-          <w:szCs w:val="26"/>
-          <w:rtl w:val="1"/>
-        </w:rPr>
-        <w:t xml:space="preserve"> </w:t>
-      </w:r>
-      <w:hyperlink r:id="rId7">
+      <w:hyperlink r:id="rIdWavDownload">
         <w:r>
           <w:rPr>
-            <w:rFonts w:ascii="Alef" w:cs="Alef" w:eastAsia="Alef" w:hAnsi="Alef"/>
-            <w:b w:val="1"/>
-            <w:bCs w:val="1"/>
-            <w:color w:val="990000"/>
+            <w:rFonts w:ascii="Alef" w:hAnsi="Alef" w:cs="Alef"/>
+            <w:b/>
+            <w:bCs/>
+            <w:color w:val="7D263D"/>
             <w:u w:val="single"/>
+            <w:sz w:val="26"/>
+            <w:szCs w:val="26"/>
+            <w:rtl w:val="1"/>
+          </w:rPr>
+          <w:t xml:space="preserve">להורדת השיר בקובץ </w:t>
+        </w:r>
+        <w:r>
+          <w:rPr>
+            <w:rFonts w:ascii="Alef" w:hAnsi="Alef" w:cs="Alef"/>
+            <w:b/>
+            <w:bCs/>
+            <w:color w:val="7D263D"/>
+            <w:u w:val="single"/>
+            <w:sz w:val="26"/>
+            <w:szCs w:val="26"/>
             <w:rtl w:val="0"/>
           </w:rPr>
-          <w:t xml:space="preserve">https://shiracarmel.com/epk.html</w:t>
+          <w:t xml:space="preserve">WAV (65 MB)</w:t>
         </w:r>
       </w:hyperlink>
-      <w:r>
-        <w:rPr>
-          <w:rtl w:val="0"/>
-        </w:rPr>
-      </w:r>
-      <w:r>
-        <w:rPr>
-          <w:rFonts w:ascii="Alef" w:cs="Alef" w:eastAsia="Alef" w:hAnsi="Alef"/>
-          <w:b w:val="1"/>
-          <w:bCs w:val="1"/>
-          <w:color w:val="635c54"/>
-          <w:sz w:val="26"/>
-          <w:szCs w:val="26"/>
-          <w:rtl w:val="1"/>
-        </w:rPr>
-        <w:t xml:space="preserve"> </w:t>
-      </w:r>
-      <w:r>
-        <w:rPr>
-          <w:rFonts w:ascii="Alef" w:cs="Alef" w:eastAsia="Alef" w:hAnsi="Alef"/>
-          <w:b w:val="1"/>
-          <w:bCs w:val="1"/>
-          <w:color w:val="635c54"/>
-          <w:sz w:val="26"/>
-          <w:szCs w:val="26"/>
-          <w:rtl w:val="1"/>
-        </w:rPr>
-        <w:t xml:space="preserve">השתמשו</w:t>
-      </w:r>
-      <w:r>
-        <w:rPr>
-          <w:rFonts w:ascii="Alef" w:cs="Alef" w:eastAsia="Alef" w:hAnsi="Alef"/>
-          <w:b w:val="1"/>
-          <w:bCs w:val="1"/>
-          <w:color w:val="635c54"/>
-          <w:sz w:val="26"/>
-          <w:szCs w:val="26"/>
-          <w:rtl w:val="1"/>
-        </w:rPr>
-        <w:t xml:space="preserve"> </w:t>
-      </w:r>
-      <w:r>
-        <w:rPr>
-          <w:rFonts w:ascii="Alef" w:cs="Alef" w:eastAsia="Alef" w:hAnsi="Alef"/>
-          <w:b w:val="1"/>
-          <w:bCs w:val="1"/>
-          <w:color w:val="635c54"/>
-          <w:sz w:val="26"/>
-          <w:szCs w:val="26"/>
-          <w:rtl w:val="1"/>
-        </w:rPr>
-        <w:t xml:space="preserve">ב</w:t>
-      </w:r>
-      <w:r>
-        <w:rPr>
-          <w:rFonts w:ascii="Alef" w:cs="Alef" w:eastAsia="Alef" w:hAnsi="Alef"/>
-          <w:b w:val="1"/>
-          <w:bCs w:val="1"/>
-          <w:color w:val="635c54"/>
-          <w:sz w:val="26"/>
-          <w:szCs w:val="26"/>
-          <w:rtl w:val="1"/>
-        </w:rPr>
-        <w:t xml:space="preserve">סיסמא</w:t>
-      </w:r>
-      <w:r>
-        <w:rPr>
-          <w:rFonts w:ascii="Alef" w:cs="Alef" w:eastAsia="Alef" w:hAnsi="Alef"/>
-          <w:b w:val="1"/>
-          <w:bCs w:val="1"/>
-          <w:color w:val="635c54"/>
-          <w:sz w:val="26"/>
-          <w:szCs w:val="26"/>
-          <w:rtl w:val="1"/>
-        </w:rPr>
-        <w:t xml:space="preserve">: 4</w:t>
-      </w:r>
-      <w:r>
-        <w:rPr>
-          <w:rFonts w:ascii="Alef" w:cs="Alef" w:eastAsia="Alef" w:hAnsi="Alef"/>
-          <w:b w:val="1"/>
-          <w:bCs w:val="1"/>
-          <w:color w:val="635c54"/>
-          <w:sz w:val="26"/>
-          <w:szCs w:val="26"/>
-          <w:rtl w:val="0"/>
-        </w:rPr>
-        <w:t xml:space="preserve">boysMayb</w:t>
-      </w:r>
-      <w:r>
-        <w:rPr>
-          <w:rFonts w:ascii="Alef" w:cs="Alef" w:eastAsia="Alef" w:hAnsi="Alef"/>
-          <w:b w:val="1"/>
-          <w:bCs w:val="1"/>
-          <w:color w:val="635c54"/>
-          <w:sz w:val="26"/>
-          <w:szCs w:val="26"/>
-          <w:rtl w:val="1"/>
-        </w:rPr>
-        <w:t xml:space="preserve">5</w:t>
-      </w:r>
     </w:p>
     <w:p>
       <w:pPr>

</xml_diff>

<commit_message>
Restore encrypted press player and WAV download; remove print control
</commit_message>
<xml_diff>
--- a/assets/four-boys-maybe-five-press-release-hebrew.docx
+++ b/assets/four-boys-maybe-five-press-release-hebrew.docx
@@ -2021,22 +2021,9 @@
             <w:u w:val="single"/>
             <w:sz w:val="26"/>
             <w:szCs w:val="26"/>
-            <w:rtl w:val="1"/>
-          </w:rPr>
-          <w:t xml:space="preserve">להורדת השיר בקובץ </w:t>
-        </w:r>
-        <w:r>
-          <w:rPr>
-            <w:rFonts w:ascii="Alef" w:hAnsi="Alef" w:cs="Alef"/>
-            <w:b/>
-            <w:bCs/>
-            <w:color w:val="7D263D"/>
-            <w:u w:val="single"/>
-            <w:sz w:val="26"/>
-            <w:szCs w:val="26"/>
             <w:rtl w:val="0"/>
           </w:rPr>
-          <w:t xml:space="preserve">WAV (65 MB)</w:t>
+          <w:t xml:space="preserve">Press Download With Password (WAV file)</w:t>
         </w:r>
       </w:hyperlink>
     </w:p>

</xml_diff>